<commit_message>
bug fixes caused by deployment
</commit_message>
<xml_diff>
--- a/server/temp/output.docx
+++ b/server/temp/output.docx
@@ -177,7 +177,7 @@
               <w:rPr>
                 <w:lang w:val="en-US"/>
               </w:rPr>
-              <w:t xml:space="preserve">001</w:t>
+              <w:t xml:space="preserve">005</w:t>
             </w:r>
           </w:p>
         </w:tc>
@@ -249,7 +249,7 @@
               <w:rPr>
                 <w:lang w:val="en-US"/>
               </w:rPr>
-              <w:t xml:space="preserve">Nicole Pantanosas</w:t>
+              <w:t xml:space="preserve">Harith (Test)</w:t>
             </w:r>
           </w:p>
         </w:tc>
@@ -451,7 +451,7 @@
               <w:rPr>
                 <w:lang w:val="en-US"/>
               </w:rPr>
-              <w:t xml:space="preserve">Block 2 Phase 1A Lot 19 Xavier Heights Subdivision</w:t>
+              <w:t xml:space="preserve">Libona</w:t>
             </w:r>
           </w:p>
         </w:tc>
@@ -684,7 +684,7 @@
                 <w:iCs/>
                 <w:lang w:val="en-US"/>
               </w:rPr>
-              <w:t xml:space="preserve">Block 2 Phase 1A Lot 19 Xavier Heights Subdivision</w:t>
+              <w:t xml:space="preserve">Libona</w:t>
             </w:r>
           </w:p>
         </w:tc>
@@ -970,7 +970,7 @@
               <w:rPr>
                 <w:lang w:val="en-US"/>
               </w:rPr>
-              <w:t xml:space="preserve">23</w:t>
+              <w:t xml:space="preserve">32</w:t>
             </w:r>
           </w:p>
         </w:tc>
@@ -1037,7 +1037,7 @@
               <w:rPr>
                 <w:lang w:val="en-US"/>
               </w:rPr>
-              <w:t xml:space="preserve">09156931379</w:t>
+              <w:t xml:space="preserve">091112223334</w:t>
             </w:r>
           </w:p>
         </w:tc>
@@ -1104,7 +1104,7 @@
               <w:rPr>
                 <w:lang w:val="en-US"/>
               </w:rPr>
-              <w:t xml:space="preserve">salagantinnicole@gmail.com</w:t>
+              <w:t xml:space="preserve">harithgoldlane@gmail.com</w:t>
             </w:r>
           </w:p>
         </w:tc>
@@ -1224,7 +1224,7 @@
               <w:rPr>
                 <w:lang w:val="en-US"/>
               </w:rPr>
-              <w:t xml:space="preserve">2026-04-30T01:12</w:t>
+              <w:t xml:space="preserve">2026-05-05T16:37</w:t>
             </w:r>
           </w:p>
         </w:tc>
@@ -1987,7 +1987,7 @@
               <w:rPr>
                 <w:lang w:val="en-US"/>
               </w:rPr>
-              <w:t xml:space="preserve">190</w:t>
+              <w:t xml:space="preserve">67</w:t>
             </w:r>
           </w:p>
         </w:tc>
@@ -2006,7 +2006,7 @@
               <w:rPr>
                 <w:lang w:val="en-US"/>
               </w:rPr>
-              <w:t xml:space="preserve">234</w:t>
+              <w:t xml:space="preserve">2342</w:t>
             </w:r>
             <w:r>
               <w:rPr>
@@ -2031,7 +2031,7 @@
               <w:rPr>
                 <w:lang w:val="en-US"/>
               </w:rPr>
-              <w:t xml:space="preserve">44460</w:t>
+              <w:t xml:space="preserve">156914</w:t>
             </w:r>
           </w:p>
         </w:tc>
@@ -2049,7 +2049,7 @@
               <w:rPr>
                 <w:lang w:val="en-US"/>
               </w:rPr>
-              <w:t xml:space="preserve">2026-04-30T01:12</w:t>
+              <w:t xml:space="preserve">2026-05-05T16:38</w:t>
             </w:r>
           </w:p>
         </w:tc>
@@ -2068,112 +2068,6 @@
                 <w:lang w:val="en-US"/>
               </w:rPr>
               <w:t xml:space="preserve">222</w:t>
-            </w:r>
-            <w:r>
-              <w:rPr>
-                <w:lang w:val="en-US"/>
-              </w:rPr>
-              <w:t/>
-            </w:r>
-          </w:p>
-        </w:tc>
-      </w:tr>
-      <w:tr>
-        <w:tc>
-          <w:tcPr>
-            <w:tcW w:w="1778" w:type="dxa"/>
-          </w:tcPr>
-          <w:p>
-            <w:pPr>
-              <w:rPr>
-                <w:lang w:val="en-US"/>
-              </w:rPr>
-            </w:pPr>
-            <w:r>
-              <w:rPr>
-                <w:lang w:val="en-US"/>
-              </w:rPr>
-              <w:t xml:space="preserve">190</w:t>
-            </w:r>
-          </w:p>
-        </w:tc>
-        <w:tc>
-          <w:tcPr>
-            <w:tcW w:w="2080" w:type="dxa"/>
-            <w:gridSpan w:val="3"/>
-          </w:tcPr>
-          <w:p>
-            <w:pPr>
-              <w:rPr>
-                <w:lang w:val="en-US"/>
-              </w:rPr>
-            </w:pPr>
-            <w:r>
-              <w:rPr>
-                <w:lang w:val="en-US"/>
-              </w:rPr>
-              <w:t xml:space="preserve">3</w:t>
-            </w:r>
-            <w:r>
-              <w:rPr>
-                <w:lang w:val="en-US"/>
-              </w:rPr>
-              <w:t/>
-            </w:r>
-          </w:p>
-        </w:tc>
-        <w:tc>
-          <w:tcPr>
-            <w:tcW w:w="1961" w:type="dxa"/>
-            <w:gridSpan w:val="2"/>
-          </w:tcPr>
-          <w:p>
-            <w:pPr>
-              <w:rPr>
-                <w:lang w:val="en-US"/>
-              </w:rPr>
-            </w:pPr>
-            <w:r>
-              <w:rPr>
-                <w:lang w:val="en-US"/>
-              </w:rPr>
-              <w:t xml:space="preserve">570</w:t>
-            </w:r>
-          </w:p>
-        </w:tc>
-        <w:tc>
-          <w:tcPr>
-            <w:tcW w:w="1688" w:type="dxa"/>
-          </w:tcPr>
-          <w:p>
-            <w:pPr>
-              <w:rPr>
-                <w:lang w:val="en-US"/>
-              </w:rPr>
-            </w:pPr>
-            <w:r>
-              <w:rPr>
-                <w:lang w:val="en-US"/>
-              </w:rPr>
-              <w:t xml:space="preserve">2026-04-30T01:12</w:t>
-            </w:r>
-          </w:p>
-        </w:tc>
-        <w:tc>
-          <w:tcPr>
-            <w:tcW w:w="1844" w:type="dxa"/>
-          </w:tcPr>
-          <w:p>
-            <w:pPr>
-              <w:rPr>
-                <w:lang w:val="en-US"/>
-              </w:rPr>
-            </w:pPr>
-            <w:r>
-              <w:rPr>
-                <w:lang w:val="en-US"/>
-              </w:rPr>
-              <w:t xml:space="preserve">3333</w:t>
             </w:r>
             <w:r>
               <w:rPr>
@@ -2263,7 +2157,7 @@
                 <w:iCs/>
                 <w:lang w:val="en-US"/>
               </w:rPr>
-              <w:t xml:space="preserve">Nicole Pantanosas</w:t>
+              <w:t xml:space="preserve">Harith (Test)</w:t>
             </w:r>
           </w:p>
           <w:p>
@@ -2574,7 +2468,7 @@
               <w:rPr>
                 <w:lang w:val="en-US"/>
               </w:rPr>
-              <w:t xml:space="preserve">001</w:t>
+              <w:t xml:space="preserve">005</w:t>
             </w:r>
           </w:p>
         </w:tc>
@@ -2646,7 +2540,7 @@
               <w:rPr>
                 <w:lang w:val="en-US"/>
               </w:rPr>
-              <w:t xml:space="preserve">Nicole Pantanosas</w:t>
+              <w:t xml:space="preserve">Harith (Test)</w:t>
             </w:r>
           </w:p>
         </w:tc>
@@ -2843,7 +2737,7 @@
               <w:rPr>
                 <w:lang w:val="en-US"/>
               </w:rPr>
-              <w:t xml:space="preserve">09156931379</w:t>
+              <w:t xml:space="preserve">091112223334</w:t>
             </w:r>
           </w:p>
         </w:tc>
@@ -2910,7 +2804,7 @@
               <w:rPr>
                 <w:lang w:val="en-US"/>
               </w:rPr>
-              <w:t xml:space="preserve">salagantinnicole@gmail.com</w:t>
+              <w:t xml:space="preserve">harithgoldlane@gmail.com</w:t>
             </w:r>
           </w:p>
         </w:tc>
@@ -3149,7 +3043,7 @@
               <w:rPr>
                 <w:lang w:val="en-US"/>
               </w:rPr>
-              <w:t xml:space="preserve">1</w:t>
+              <w:t xml:space="preserve">001</w:t>
             </w:r>
           </w:p>
         </w:tc>
@@ -3167,7 +3061,7 @@
               <w:rPr>
                 <w:lang w:val="en-US"/>
               </w:rPr>
-              <w:t xml:space="preserve">Liberica</w:t>
+              <w:t xml:space="preserve">Mr Bean (test)</w:t>
             </w:r>
           </w:p>
         </w:tc>
@@ -3185,7 +3079,7 @@
               <w:rPr>
                 <w:lang w:val="en-US"/>
               </w:rPr>
-              <w:t xml:space="preserve">190</w:t>
+              <w:t xml:space="preserve">67</w:t>
             </w:r>
           </w:p>
         </w:tc>
@@ -3204,7 +3098,7 @@
               <w:rPr>
                 <w:lang w:val="en-US"/>
               </w:rPr>
-              <w:t xml:space="preserve">234</w:t>
+              <w:t xml:space="preserve">2342</w:t>
             </w:r>
           </w:p>
         </w:tc>
@@ -3222,7 +3116,7 @@
               <w:rPr>
                 <w:lang w:val="en-US"/>
               </w:rPr>
-              <w:t xml:space="preserve">44460</w:t>
+              <w:t xml:space="preserve">156914</w:t>
             </w:r>
           </w:p>
         </w:tc>
@@ -3240,118 +3134,7 @@
               <w:rPr>
                 <w:lang w:val="en-US"/>
               </w:rPr>
-              <w:t xml:space="preserve">2026-04-30T01:12</w:t>
-            </w:r>
-          </w:p>
-        </w:tc>
-      </w:tr>
-      <w:tr>
-        <w:tc>
-          <w:tcPr>
-            <w:tcW w:w="1612" w:type="dxa"/>
-          </w:tcPr>
-          <w:p>
-            <w:pPr>
-              <w:rPr>
-                <w:lang w:val="en-US"/>
-              </w:rPr>
-            </w:pPr>
-            <w:r>
-              <w:rPr>
-                <w:lang w:val="en-US"/>
-              </w:rPr>
-              <w:t xml:space="preserve">2</w:t>
-            </w:r>
-          </w:p>
-        </w:tc>
-        <w:tc>
-          <w:tcPr>
-            <w:tcW w:w="1360" w:type="dxa"/>
-          </w:tcPr>
-          <w:p>
-            <w:pPr>
-              <w:rPr>
-                <w:lang w:val="en-US"/>
-              </w:rPr>
-            </w:pPr>
-            <w:r>
-              <w:rPr>
-                <w:lang w:val="en-US"/>
-              </w:rPr>
-              <w:t xml:space="preserve">Liberica</w:t>
-            </w:r>
-          </w:p>
-        </w:tc>
-        <w:tc>
-          <w:tcPr>
-            <w:tcW w:w="1289" w:type="dxa"/>
-          </w:tcPr>
-          <w:p>
-            <w:pPr>
-              <w:rPr>
-                <w:lang w:val="en-US"/>
-              </w:rPr>
-            </w:pPr>
-            <w:r>
-              <w:rPr>
-                <w:lang w:val="en-US"/>
-              </w:rPr>
-              <w:t xml:space="preserve">190</w:t>
-            </w:r>
-          </w:p>
-        </w:tc>
-        <w:tc>
-          <w:tcPr>
-            <w:tcW w:w="1249" w:type="dxa"/>
-            <w:gridSpan w:val="2"/>
-          </w:tcPr>
-          <w:p>
-            <w:pPr>
-              <w:rPr>
-                <w:lang w:val="en-US"/>
-              </w:rPr>
-            </w:pPr>
-            <w:r>
-              <w:rPr>
-                <w:lang w:val="en-US"/>
-              </w:rPr>
-              <w:t xml:space="preserve">3</w:t>
-            </w:r>
-          </w:p>
-        </w:tc>
-        <w:tc>
-          <w:tcPr>
-            <w:tcW w:w="1700" w:type="dxa"/>
-          </w:tcPr>
-          <w:p>
-            <w:pPr>
-              <w:rPr>
-                <w:lang w:val="en-US"/>
-              </w:rPr>
-            </w:pPr>
-            <w:r>
-              <w:rPr>
-                <w:lang w:val="en-US"/>
-              </w:rPr>
-              <w:t xml:space="preserve">570</w:t>
-            </w:r>
-          </w:p>
-        </w:tc>
-        <w:tc>
-          <w:tcPr>
-            <w:tcW w:w="2146" w:type="dxa"/>
-          </w:tcPr>
-          <w:p>
-            <w:pPr>
-              <w:rPr>
-                <w:lang w:val="en-US"/>
-              </w:rPr>
-            </w:pPr>
-            <w:r>
-              <w:rPr>
-                <w:lang w:val="en-US"/>
-              </w:rPr>
-              <w:t xml:space="preserve">2026-04-30T01:12</w:t>
+              <w:t xml:space="preserve">2026-05-05T16:38</w:t>
             </w:r>
           </w:p>
         </w:tc>
@@ -3382,7 +3165,7 @@
               <w:rPr>
                 <w:lang w:val="en-US"/>
               </w:rPr>
-              <w:t xml:space="preserve"> 45030</w:t>
+              <w:t xml:space="preserve"> 156914</w:t>
             </w:r>
           </w:p>
         </w:tc>
@@ -3413,7 +3196,7 @@
               <w:rPr>
                 <w:lang w:val="en-US"/>
               </w:rPr>
-              <w:t xml:space="preserve"> Forty Five Thousand Thirty Pesos Only</w:t>
+              <w:t xml:space="preserve"> One Hundred Fifty Six Thousand Nine Hundred Fourteen Pesos Only</w:t>
             </w:r>
           </w:p>
         </w:tc>
@@ -3497,7 +3280,7 @@
                 <w:iCs/>
                 <w:lang w:val="en-US"/>
               </w:rPr>
-              <w:t xml:space="preserve">Nicole Pantanosas</w:t>
+              <w:t xml:space="preserve">Harith (Test)</w:t>
             </w:r>
           </w:p>
           <w:p>

</xml_diff>